<commit_message>
ianb adversary-complaint, motion-brief: typst and docx on the shared cross-engine layout model, Times New Roman 12 pt (was EB Garamond / Times 13 pt: the filed exemplars' size); docx/make-reference.sh and reference.docx give way to docx/reference.xml (base="xengine", 'Page X of Y' footer rIdFooter2); paragraph numbers 'N.' on a 1 in tab in both engines; the motion's typst carries a line whose footnote does not fit to the next page with the note, as Word does (local carry rule); docx XENG-001..003 pass on all four INPUTs (95/95, 126/126, 69/69, 143/143 lines), params.cross_engine: gate (fb-595.68.7)
</commit_message>
<xml_diff>
--- a/courts/eighth-circuit/iowa/federal/bankruptcy-northern-district/adversary-complaint/usage/OUTPUT-adversary-complaint-2.docx
+++ b/courts/eighth-circuit/iowa/federal/bankruptcy-northern-district/adversary-complaint/usage/OUTPUT-adversary-complaint-2.docx
@@ -4,7 +4,8 @@
   <w:body>
     <w:p>
       <w:pPr>
-        <w:spacing w:before="0" w:after="60" w:line="240" w:lineRule="auto"/>
+        <w:spacing w:before="0" w:after="0" w:line="276" w:lineRule="exact"/>
+        <w:ind w:left="0" w:firstLine="0"/>
         <w:jc w:val="center"/>
       </w:pPr>
       <w:r>
@@ -17,7 +18,8 @@
     </w:p>
     <w:p>
       <w:pPr>
-        <w:spacing w:before="0" w:after="0" w:line="240" w:lineRule="auto"/>
+        <w:spacing w:before="0" w:after="360" w:line="276" w:lineRule="exact"/>
+        <w:ind w:left="0" w:firstLine="0"/>
         <w:jc w:val="center"/>
       </w:pPr>
       <w:r>
@@ -28,28 +30,17 @@
         <w:t xml:space="preserve">FOR THE NORTHERN DISTRICT OF IOWA</w:t>
       </w:r>
     </w:p>
-    <w:p>
-      <w:pPr>
-        <w:spacing w:before="0" w:after="0" w:line="390" w:lineRule="exact"/>
-      </w:pPr>
-    </w:p>
     <w:tbl>
       <w:tblPr>
         <w:tblW w:w="9360" w:type="dxa"/>
-        <w:tblBorders>
-          <w:top w:val="nil"/>
-          <w:left w:val="nil"/>
-          <w:bottom w:val="nil"/>
-          <w:right w:val="nil"/>
-          <w:insideH w:val="nil"/>
-          <w:insideV w:val="nil"/>
-        </w:tblBorders>
         <w:tblLayout w:type="fixed"/>
         <w:tblCellMar>
+          <w:top w:w="0" w:type="dxa"/>
           <w:left w:w="0" w:type="dxa"/>
+          <w:bottom w:w="0" w:type="dxa"/>
           <w:right w:w="0" w:type="dxa"/>
         </w:tblCellMar>
-        <w:tblLook w:val="0000"/>
+        <w:tblLook w:val="0000" w:firstRow="0" w:lastRow="0" w:firstColumn="0" w:lastColumn="0" w:noHBand="0" w:noVBand="0"/>
       </w:tblPr>
       <w:tblGrid>
         <w:gridCol w:w="4752"/>
@@ -63,90 +54,157 @@
           <w:tcPr>
             <w:tcW w:w="4752" w:type="dxa"/>
             <w:tcBorders>
+              <w:bottom w:val="single" w:sz="6" w:space="0" w:color="000000"/>
               <w:right w:val="single" w:sz="6" w:space="0" w:color="000000"/>
-              <w:bottom w:val="single" w:sz="6" w:space="0" w:color="000000"/>
             </w:tcBorders>
             <w:tcMar>
+              <w:bottom w:w="200" w:type="dxa"/>
               <w:right w:w="240" w:type="dxa"/>
-              <w:bottom w:w="200" w:type="dxa"/>
             </w:tcMar>
           </w:tcPr>
           <w:p>
             <w:pPr>
-              <w:spacing w:before="0" w:after="156" w:line="240" w:lineRule="auto"/>
+              <w:spacing w:before="0" w:after="0" w:line="276" w:lineRule="exact"/>
+              <w:ind w:left="0" w:firstLine="0"/>
+              <w:jc w:val="left"/>
             </w:pPr>
             <w:r>
-              <w:rPr/>
               <w:t xml:space="preserve">In re:</w:t>
             </w:r>
           </w:p>
           <w:p>
             <w:pPr>
-              <w:spacing w:before="0" w:after="156" w:line="240" w:lineRule="auto"/>
-              <w:ind w:left="720"/>
+              <w:spacing w:before="276" w:after="0" w:line="276" w:lineRule="exact"/>
+              <w:ind w:left="720" w:firstLine="0"/>
+              <w:jc w:val="left"/>
             </w:pPr>
             <w:r>
-              <w:rPr/>
-              <w:t xml:space="preserve">BDC GROUP, INC.,</w:t>
+              <w:t xml:space="preserve">BDC</w:t>
+            </w:r>
+            <w:r>
+              <w:t xml:space="preserve"> </w:t>
+            </w:r>
+            <w:r>
+              <w:t xml:space="preserve">GROUP,</w:t>
+            </w:r>
+            <w:r>
+              <w:t xml:space="preserve"> </w:t>
+            </w:r>
+            <w:r>
+              <w:t xml:space="preserve">INC.,</w:t>
             </w:r>
           </w:p>
           <w:p>
             <w:pPr>
-              <w:spacing w:before="0" w:after="208" w:line="240" w:lineRule="auto"/>
+              <w:spacing w:before="276" w:after="0" w:line="276" w:lineRule="exact"/>
+              <w:ind w:left="0" w:firstLine="0"/>
               <w:jc w:val="right"/>
             </w:pPr>
             <w:r>
-              <w:rPr/>
               <w:t xml:space="preserve">Debtor.</w:t>
             </w:r>
           </w:p>
           <w:p>
             <w:pPr>
-              <w:spacing w:before="0" w:after="156" w:line="240" w:lineRule="auto"/>
-              <w:ind w:left="720"/>
+              <w:spacing w:before="276" w:after="0" w:line="276" w:lineRule="exact"/>
+              <w:ind w:left="720" w:firstLine="0"/>
+              <w:jc w:val="left"/>
             </w:pPr>
             <w:r>
-              <w:rPr/>
-              <w:t xml:space="preserve">RENEE HANRAHAN, in her sole capacity as Trustee,</w:t>
+              <w:t xml:space="preserve">RENEE</w:t>
+            </w:r>
+            <w:r>
+              <w:t xml:space="preserve"> </w:t>
+            </w:r>
+            <w:r>
+              <w:t xml:space="preserve">HANRAHAN,</w:t>
+            </w:r>
+            <w:r>
+              <w:t xml:space="preserve"> </w:t>
+            </w:r>
+            <w:r>
+              <w:t xml:space="preserve">in</w:t>
+            </w:r>
+            <w:r>
+              <w:t xml:space="preserve"> </w:t>
+            </w:r>
+            <w:r>
+              <w:t xml:space="preserve">her</w:t>
+            </w:r>
+            <w:r>
+              <w:t xml:space="preserve"> </w:t>
+            </w:r>
+            <w:r>
+              <w:t xml:space="preserve">sole</w:t>
+            </w:r>
+            <w:r>
+              <w:t xml:space="preserve"> </w:t>
+            </w:r>
+            <w:r>
+              <w:t xml:space="preserve">capacity</w:t>
+            </w:r>
+            <w:r>
+              <w:t xml:space="preserve"> </w:t>
+            </w:r>
+            <w:r>
+              <w:t xml:space="preserve">as</w:t>
+            </w:r>
+            <w:r>
+              <w:t xml:space="preserve"> </w:t>
+            </w:r>
+            <w:r>
+              <w:t xml:space="preserve">Trustee,</w:t>
             </w:r>
           </w:p>
           <w:p>
             <w:pPr>
-              <w:spacing w:before="0" w:after="156" w:line="240" w:lineRule="auto"/>
+              <w:spacing w:before="276" w:after="0" w:line="276" w:lineRule="exact"/>
+              <w:ind w:left="0" w:firstLine="0"/>
               <w:jc w:val="right"/>
             </w:pPr>
             <w:r>
-              <w:rPr/>
               <w:t xml:space="preserve">Plaintiff,</w:t>
             </w:r>
           </w:p>
           <w:p>
             <w:pPr>
-              <w:spacing w:before="0" w:after="156" w:line="240" w:lineRule="auto"/>
-              <w:ind w:left="720"/>
+              <w:spacing w:before="276" w:after="0" w:line="276" w:lineRule="exact"/>
+              <w:ind w:left="720" w:firstLine="0"/>
+              <w:jc w:val="left"/>
             </w:pPr>
             <w:r>
-              <w:rPr/>
               <w:t xml:space="preserve">v.</w:t>
             </w:r>
           </w:p>
           <w:p>
             <w:pPr>
-              <w:spacing w:before="0" w:after="156" w:line="240" w:lineRule="auto"/>
-              <w:ind w:left="720"/>
+              <w:spacing w:before="276" w:after="0" w:line="276" w:lineRule="exact"/>
+              <w:ind w:left="720" w:firstLine="0"/>
+              <w:jc w:val="left"/>
             </w:pPr>
             <w:r>
-              <w:rPr/>
-              <w:t xml:space="preserve">COMSTAR SUPPLY, INC.</w:t>
+              <w:t xml:space="preserve">COMSTAR</w:t>
+            </w:r>
+            <w:r>
+              <w:t xml:space="preserve"> </w:t>
+            </w:r>
+            <w:r>
+              <w:t xml:space="preserve">SUPPLY,</w:t>
+            </w:r>
+            <w:r>
+              <w:t xml:space="preserve"> </w:t>
+            </w:r>
+            <w:r>
+              <w:t xml:space="preserve">INC.</w:t>
             </w:r>
           </w:p>
           <w:p>
             <w:pPr>
-              <w:spacing w:before="0" w:after="0" w:line="240" w:lineRule="auto"/>
+              <w:spacing w:before="276" w:after="0" w:line="276" w:lineRule="exact"/>
+              <w:ind w:left="0" w:firstLine="0"/>
               <w:jc w:val="right"/>
             </w:pPr>
             <w:r>
-              <w:rPr/>
               <w:t xml:space="preserve">Defendant.</w:t>
             </w:r>
           </w:p>
@@ -155,47 +213,151 @@
           <w:tcPr>
             <w:tcW w:w="4608" w:type="dxa"/>
             <w:tcMar>
-              <w:top w:w="520" w:type="dxa"/>
               <w:left w:w="320" w:type="dxa"/>
             </w:tcMar>
           </w:tcPr>
           <w:p>
             <w:pPr>
-              <w:spacing w:before="0" w:after="104" w:line="240" w:lineRule="auto"/>
+              <w:spacing w:before="552" w:after="0" w:line="276" w:lineRule="exact"/>
+              <w:ind w:left="0" w:firstLine="0"/>
+              <w:jc w:val="left"/>
             </w:pPr>
             <w:r>
-              <w:rPr/>
-              <w:t xml:space="preserve">Chapter 7 Bankruptcy</w:t>
+              <w:t xml:space="preserve">Chapter</w:t>
+            </w:r>
+            <w:r>
+              <w:t xml:space="preserve"> </w:t>
+            </w:r>
+            <w:r>
+              <w:t xml:space="preserve">7</w:t>
+            </w:r>
+            <w:r>
+              <w:t xml:space="preserve"> </w:t>
+            </w:r>
+            <w:r>
+              <w:t xml:space="preserve">Bankruptcy</w:t>
             </w:r>
           </w:p>
           <w:p>
             <w:pPr>
-              <w:spacing w:before="0" w:after="416" w:line="240" w:lineRule="auto"/>
+              <w:spacing w:before="0" w:after="0" w:line="276" w:lineRule="exact"/>
+              <w:ind w:left="0" w:firstLine="0"/>
+              <w:jc w:val="left"/>
             </w:pPr>
             <w:r>
-              <w:rPr/>
-              <w:t xml:space="preserve">Case No. 23-00484</w:t>
+              <w:t xml:space="preserve">Case</w:t>
+            </w:r>
+            <w:r>
+              <w:t xml:space="preserve"> </w:t>
+            </w:r>
+            <w:r>
+              <w:t xml:space="preserve">No.</w:t>
+            </w:r>
+            <w:r>
+              <w:t xml:space="preserve"> </w:t>
+            </w:r>
+            <w:r>
+              <w:t xml:space="preserve">23</w:t>
+              <w:noBreakHyphen/>
+              <w:t xml:space="preserve">00484</w:t>
             </w:r>
           </w:p>
           <w:p>
             <w:pPr>
-              <w:spacing w:before="0" w:after="416" w:line="240" w:lineRule="auto"/>
+              <w:spacing w:before="276" w:after="0" w:line="276" w:lineRule="exact"/>
+              <w:ind w:left="0" w:firstLine="0"/>
+              <w:jc w:val="left"/>
             </w:pPr>
             <w:r>
-              <w:rPr/>
-              <w:t xml:space="preserve">Adversary Case No. ____________</w:t>
+              <w:t xml:space="preserve">Adversary</w:t>
+            </w:r>
+            <w:r>
+              <w:t xml:space="preserve"> </w:t>
+            </w:r>
+            <w:r>
+              <w:t xml:space="preserve">Case</w:t>
+            </w:r>
+            <w:r>
+              <w:t xml:space="preserve"> </w:t>
+            </w:r>
+            <w:r>
+              <w:t xml:space="preserve">No.</w:t>
+            </w:r>
+            <w:r>
+              <w:t xml:space="preserve"> </w:t>
+            </w:r>
+            <w:r>
+              <w:t xml:space="preserve">____________</w:t>
             </w:r>
           </w:p>
           <w:p>
             <w:pPr>
-              <w:spacing w:before="0" w:after="0" w:line="240" w:lineRule="auto"/>
+              <w:spacing w:before="276" w:after="0" w:line="276" w:lineRule="exact"/>
+              <w:ind w:left="0" w:firstLine="0"/>
+              <w:jc w:val="left"/>
             </w:pPr>
             <w:r>
               <w:rPr>
                 <w:b/>
                 <w:bCs/>
               </w:rPr>
-              <w:t xml:space="preserve">COMPLAINT TO AVOID PREFERENTIAL TRANSFERS</w:t>
+              <w:t xml:space="preserve">COMPLAINT</w:t>
+            </w:r>
+            <w:r>
+              <w:rPr>
+                <w:b/>
+                <w:bCs/>
+              </w:rPr>
+              <w:t xml:space="preserve"> </w:t>
+            </w:r>
+            <w:r>
+              <w:rPr>
+                <w:b/>
+                <w:bCs/>
+              </w:rPr>
+              <w:t xml:space="preserve">TO</w:t>
+            </w:r>
+            <w:r>
+              <w:rPr>
+                <w:b/>
+                <w:bCs/>
+              </w:rPr>
+              <w:t xml:space="preserve"> </w:t>
+            </w:r>
+            <w:r>
+              <w:rPr>
+                <w:b/>
+                <w:bCs/>
+              </w:rPr>
+              <w:t xml:space="preserve">AVOID</w:t>
+            </w:r>
+            <w:r>
+              <w:rPr>
+                <w:b/>
+                <w:bCs/>
+              </w:rPr>
+              <w:t xml:space="preserve"> </w:t>
+            </w:r>
+            <w:r>
+              <w:rPr>
+                <w:b/>
+                <w:bCs/>
+              </w:rPr>
+              <w:t xml:space="preserve">PREFERENTIAL</w:t>
+            </w:r>
+            <w:r>
+              <w:rPr>
+                <w:b/>
+                <w:bCs/>
+              </w:rPr>
+              <w:t xml:space="preserve"> </w:t>
+            </w:r>
+            <w:r>
+              <w:rPr>
+                <w:b/>
+                <w:bCs/>
+              </w:rPr>
+              <w:t xml:space="preserve">TRANSFERS</w:t>
             </w:r>
           </w:p>
         </w:tc>
@@ -203,12 +365,12 @@
     </w:tbl>
     <w:p>
       <w:pPr>
-        <w:spacing w:before="0" w:after="0" w:line="312" w:lineRule="exact"/>
-      </w:pPr>
-    </w:p>
-    <w:p>
-      <w:pPr>
-        <w:pStyle w:val="FirstParagraph"/>
+        <w:spacing w:before="0" w:after="0" w:line="288" w:lineRule="exact"/>
+      </w:pPr>
+    </w:p>
+    <w:p>
+      <w:pPr>
+        <w:pStyle w:val="PlainParagraph"/>
       </w:pPr>
       <w:r>
         <w:t xml:space="preserve">COMES NOW Plaintiff Trustee Renee Hanrahan, by and through her counsel, and in support of this Complaint, respectfully states:</w:t>
@@ -263,7 +425,7 @@
         <w:tab/>
       </w:r>
       <w:r>
-        <w:t xml:space="preserve">This is a core proceeding by operation of 28 U.S.C. §157(b)(2)(A), (F), and (O).</w:t>
+        <w:t xml:space="preserve">This is a core proceeding by operation of 28 U.S.C. §157(b)⁠(2)⁠(A), (F), and (O).</w:t>
       </w:r>
     </w:p>
     <w:p>
@@ -301,7 +463,7 @@
         <w:tab/>
       </w:r>
       <w:r>
-        <w:t xml:space="preserve">Debtor BDC Group, Inc. (</w:t>
+        <w:t xml:space="preserve">Debtor BDC Group, Inc. (</w:t>
       </w:r>
       <w:r>
         <w:t xml:space="preserve">“Debtor”</w:t>
@@ -686,7 +848,7 @@
         <w:tab/>
       </w:r>
       <w:r>
-        <w:t xml:space="preserve">Pursuant to 11 U.S.C. § 502(d), any claim(s) of Defendant against the Debtor must be disallowed until such time as Defendant pays to Plaintiff an amount equal to the aggregate amount of all the avoidable transfers, plus interest thereon and costs.</w:t>
+        <w:t xml:space="preserve">Pursuant to 11 U.S.C. § 502(d), any claim(s) of Defendant against the Debtor must be disallowed until such time as Defendant pays to Plaintiff an amount equal to the aggregate amount of all the avoidable transfers, plus interest thereon and costs.</w:t>
       </w:r>
     </w:p>
     <w:p>
@@ -701,7 +863,7 @@
     </w:p>
     <w:p>
       <w:pPr>
-        <w:pStyle w:val="FirstParagraph"/>
+        <w:pStyle w:val="PlainParagraph"/>
       </w:pPr>
       <w:r>
         <w:t xml:space="preserve">WHEREFORE, the Plaintiff respectfully requests that this Court grant judgment as follows:</w:t>
@@ -825,158 +987,318 @@
         <w:t xml:space="preserve">Ordering such other and further relief as the Court may deem just and proper in law or equity.</w:t>
       </w:r>
     </w:p>
-    <w:tbl>
-      <w:tblPr>
-        <w:tblW w:w="9360" w:type="dxa"/>
-        <w:tblBorders>
-          <w:top w:val="nil"/>
-          <w:left w:val="nil"/>
-          <w:bottom w:val="nil"/>
-          <w:right w:val="nil"/>
-          <w:insideH w:val="nil"/>
-          <w:insideV w:val="nil"/>
-        </w:tblBorders>
-        <w:tblLayout w:type="fixed"/>
-        <w:tblCellMar>
-          <w:left w:w="0" w:type="dxa"/>
-          <w:right w:w="0" w:type="dxa"/>
-        </w:tblCellMar>
-        <w:tblLook w:val="0000"/>
-      </w:tblPr>
-      <w:tblGrid>
-        <w:gridCol w:w="3744"/>
-        <w:gridCol w:w="5616"/>
-      </w:tblGrid>
-      <w:tr>
-        <w:trPr>
-          <w:cantSplit/>
-        </w:trPr>
-        <w:tc>
-          <w:tcPr>
-            <w:tcW w:w="3744" w:type="dxa"/>
-          </w:tcPr>
-          <w:p>
-            <w:pPr>
-              <w:spacing w:before="468" w:after="0" w:line="240" w:lineRule="auto"/>
-            </w:pPr>
-            <w:r>
-              <w:rPr/>
-              <w:t xml:space="preserve">Dated: May 27, 2025</w:t>
-            </w:r>
-          </w:p>
-        </w:tc>
-        <w:tc>
-          <w:tcPr>
-            <w:tcW w:w="5616" w:type="dxa"/>
-          </w:tcPr>
-          <w:p>
-            <w:pPr>
-              <w:spacing w:before="468" w:after="689" w:line="240" w:lineRule="auto"/>
-            </w:pPr>
-            <w:r>
-              <w:rPr/>
-              <w:t xml:space="preserve">Respectfully submitted,</w:t>
-            </w:r>
-          </w:p>
-          <w:p>
-            <w:pPr>
-              <w:spacing w:before="0" w:after="65" w:line="240" w:lineRule="auto"/>
-            </w:pPr>
-            <w:r>
-              <w:rPr>
-                <w:i/>
-                <w:iCs/>
-              </w:rPr>
-              <w:t xml:space="preserve">/s/ Elizabeth M. Lally</w:t>
-            </w:r>
-          </w:p>
-          <w:p>
-            <w:pPr>
-              <w:spacing w:before="0" w:after="65" w:line="240" w:lineRule="auto"/>
-            </w:pPr>
-            <w:r>
-              <w:rPr/>
-              <w:t xml:space="preserve">Elizabeth M. Lally, AT0013010</w:t>
-            </w:r>
-          </w:p>
-          <w:p>
-            <w:pPr>
-              <w:spacing w:before="0" w:after="65" w:line="240" w:lineRule="auto"/>
-            </w:pPr>
-            <w:r>
-              <w:rPr/>
-              <w:t xml:space="preserve">12020 Shamrock Plaza, Suite 200</w:t>
-            </w:r>
-          </w:p>
-          <w:p>
-            <w:pPr>
-              <w:spacing w:before="0" w:after="65" w:line="240" w:lineRule="auto"/>
-            </w:pPr>
-            <w:r>
-              <w:rPr/>
-              <w:t xml:space="preserve">Omaha, NE 68154</w:t>
-            </w:r>
-          </w:p>
-          <w:p>
-            <w:pPr>
-              <w:spacing w:before="0" w:after="65" w:line="240" w:lineRule="auto"/>
-            </w:pPr>
-            <w:r>
-              <w:rPr/>
-              <w:t xml:space="preserve">LALLY LEGAL GROUP LLC</w:t>
-            </w:r>
-          </w:p>
-          <w:p>
-            <w:pPr>
-              <w:spacing w:before="0" w:after="65" w:line="240" w:lineRule="auto"/>
-            </w:pPr>
-            <w:r>
-              <w:rPr/>
-              <w:t xml:space="preserve">Telephone: 402-778-4840</w:t>
-            </w:r>
-          </w:p>
-          <w:p>
-            <w:pPr>
-              <w:spacing w:before="0" w:after="65" w:line="240" w:lineRule="auto"/>
-            </w:pPr>
-            <w:r>
-              <w:rPr/>
-              <w:t xml:space="preserve">Fax: [not on the filed copy]</w:t>
-            </w:r>
-          </w:p>
-          <w:p>
-            <w:pPr>
-              <w:spacing w:before="0" w:after="325" w:line="240" w:lineRule="auto"/>
-            </w:pPr>
-            <w:r>
-              <w:rPr/>
-              <w:t xml:space="preserve">E-mail: elally@lally-legal.com</w:t>
-            </w:r>
-          </w:p>
-          <w:p>
-            <w:pPr>
-              <w:spacing w:before="0" w:after="0" w:line="240" w:lineRule="auto"/>
-            </w:pPr>
-            <w:r>
-              <w:rPr/>
-              <w:t xml:space="preserve">Attorney for Plaintiff Trustee</w:t>
-            </w:r>
-          </w:p>
-        </w:tc>
-      </w:tr>
-    </w:tbl>
-    <w:p>
-      <w:pPr>
-        <w:spacing w:before="0" w:after="0" w:line="240" w:lineRule="exact"/>
-      </w:pPr>
+    <w:p>
+      <w:pPr>
+        <w:keepNext/>
+        <w:keepLines/>
+        <w:tabs>
+          <w:tab w:val="left" w:pos="3744"/>
+        </w:tabs>
+        <w:spacing w:before="432" w:after="0" w:line="276" w:lineRule="exact"/>
+        <w:ind w:left="0" w:firstLine="0"/>
+        <w:jc w:val="left"/>
+      </w:pPr>
+      <w:r>
+        <w:t xml:space="preserve">Dated: </w:t>
+      </w:r>
+      <w:r>
+        <w:t xml:space="preserve">May</w:t>
+      </w:r>
+      <w:r>
+        <w:t xml:space="preserve"> </w:t>
+      </w:r>
+      <w:r>
+        <w:t xml:space="preserve">27,</w:t>
+      </w:r>
+      <w:r>
+        <w:t xml:space="preserve"> </w:t>
+      </w:r>
+      <w:r>
+        <w:t xml:space="preserve">2025</w:t>
+      </w:r>
+      <w:r>
+        <w:tab/>
+      </w:r>
+      <w:r>
+        <w:t xml:space="preserve">Respectfully submitted,</w:t>
+      </w:r>
+    </w:p>
+    <w:p>
+      <w:pPr>
+        <w:keepNext/>
+        <w:keepLines/>
+        <w:spacing w:before="576" w:after="0" w:line="276" w:lineRule="exact"/>
+        <w:ind w:left="3744" w:firstLine="0"/>
+        <w:jc w:val="left"/>
+      </w:pPr>
+      <w:r>
+        <w:rPr>
+          <w:i/>
+          <w:iCs/>
+        </w:rPr>
+        <w:t xml:space="preserve">/s/ </w:t>
+      </w:r>
+      <w:r>
+        <w:rPr>
+          <w:i/>
+          <w:iCs/>
+        </w:rPr>
+        <w:t xml:space="preserve">Elizabeth</w:t>
+      </w:r>
+      <w:r>
+        <w:rPr>
+          <w:i/>
+          <w:iCs/>
+        </w:rPr>
+        <w:t xml:space="preserve"> </w:t>
+      </w:r>
+      <w:r>
+        <w:rPr>
+          <w:i/>
+          <w:iCs/>
+        </w:rPr>
+        <w:t xml:space="preserve">M.</w:t>
+      </w:r>
+      <w:r>
+        <w:rPr>
+          <w:i/>
+          <w:iCs/>
+        </w:rPr>
+        <w:t xml:space="preserve"> </w:t>
+      </w:r>
+      <w:r>
+        <w:rPr>
+          <w:i/>
+          <w:iCs/>
+        </w:rPr>
+        <w:t xml:space="preserve">Lally</w:t>
+      </w:r>
+    </w:p>
+    <w:p>
+      <w:pPr>
+        <w:keepNext/>
+        <w:keepLines/>
+        <w:spacing w:before="0" w:after="0" w:line="276" w:lineRule="exact"/>
+        <w:ind w:left="3744" w:firstLine="0"/>
+        <w:jc w:val="left"/>
+      </w:pPr>
+      <w:r>
+        <w:t xml:space="preserve">Elizabeth</w:t>
+      </w:r>
+      <w:r>
+        <w:t xml:space="preserve"> </w:t>
+      </w:r>
+      <w:r>
+        <w:t xml:space="preserve">M.</w:t>
+      </w:r>
+      <w:r>
+        <w:t xml:space="preserve"> </w:t>
+      </w:r>
+      <w:r>
+        <w:t xml:space="preserve">Lally</w:t>
+      </w:r>
+      <w:r>
+        <w:t xml:space="preserve">, </w:t>
+      </w:r>
+      <w:r>
+        <w:t xml:space="preserve">AT0013010</w:t>
+      </w:r>
+    </w:p>
+    <w:p>
+      <w:pPr>
+        <w:keepNext/>
+        <w:keepLines/>
+        <w:spacing w:before="0" w:after="0" w:line="276" w:lineRule="exact"/>
+        <w:ind w:left="3744" w:firstLine="0"/>
+        <w:jc w:val="left"/>
+      </w:pPr>
+      <w:r>
+        <w:t xml:space="preserve">12020</w:t>
+      </w:r>
+      <w:r>
+        <w:t xml:space="preserve"> </w:t>
+      </w:r>
+      <w:r>
+        <w:t xml:space="preserve">Shamrock</w:t>
+      </w:r>
+      <w:r>
+        <w:t xml:space="preserve"> </w:t>
+      </w:r>
+      <w:r>
+        <w:t xml:space="preserve">Plaza,</w:t>
+      </w:r>
+      <w:r>
+        <w:t xml:space="preserve"> </w:t>
+      </w:r>
+      <w:r>
+        <w:t xml:space="preserve">Suite</w:t>
+      </w:r>
+      <w:r>
+        <w:t xml:space="preserve"> </w:t>
+      </w:r>
+      <w:r>
+        <w:t xml:space="preserve">200</w:t>
+      </w:r>
+    </w:p>
+    <w:p>
+      <w:pPr>
+        <w:keepNext/>
+        <w:keepLines/>
+        <w:spacing w:before="0" w:after="0" w:line="276" w:lineRule="exact"/>
+        <w:ind w:left="3744" w:firstLine="0"/>
+        <w:jc w:val="left"/>
+      </w:pPr>
+      <w:r>
+        <w:t xml:space="preserve">Omaha,</w:t>
+      </w:r>
+      <w:r>
+        <w:t xml:space="preserve"> </w:t>
+      </w:r>
+      <w:r>
+        <w:t xml:space="preserve">NE</w:t>
+      </w:r>
+      <w:r>
+        <w:t xml:space="preserve"> </w:t>
+      </w:r>
+      <w:r>
+        <w:t xml:space="preserve">68154</w:t>
+      </w:r>
+    </w:p>
+    <w:p>
+      <w:pPr>
+        <w:keepNext/>
+        <w:keepLines/>
+        <w:spacing w:before="0" w:after="0" w:line="276" w:lineRule="exact"/>
+        <w:ind w:left="3744" w:firstLine="0"/>
+        <w:jc w:val="left"/>
+      </w:pPr>
+      <w:r>
+        <w:t xml:space="preserve">LALLY</w:t>
+      </w:r>
+      <w:r>
+        <w:t xml:space="preserve"> </w:t>
+      </w:r>
+      <w:r>
+        <w:t xml:space="preserve">LEGAL</w:t>
+      </w:r>
+      <w:r>
+        <w:t xml:space="preserve"> </w:t>
+      </w:r>
+      <w:r>
+        <w:t xml:space="preserve">GROUP</w:t>
+      </w:r>
+      <w:r>
+        <w:t xml:space="preserve"> </w:t>
+      </w:r>
+      <w:r>
+        <w:t xml:space="preserve">LLC</w:t>
+      </w:r>
+    </w:p>
+    <w:p>
+      <w:pPr>
+        <w:keepNext/>
+        <w:keepLines/>
+        <w:spacing w:before="0" w:after="0" w:line="276" w:lineRule="exact"/>
+        <w:ind w:left="3744" w:firstLine="0"/>
+        <w:jc w:val="left"/>
+      </w:pPr>
+      <w:r>
+        <w:t xml:space="preserve">Telephone: </w:t>
+      </w:r>
+      <w:r>
+        <w:t xml:space="preserve">402</w:t>
+        <w:noBreakHyphen/>
+        <w:t xml:space="preserve">778</w:t>
+        <w:noBreakHyphen/>
+        <w:t xml:space="preserve">4840</w:t>
+      </w:r>
+    </w:p>
+    <w:p>
+      <w:pPr>
+        <w:keepNext/>
+        <w:keepLines/>
+        <w:spacing w:before="0" w:after="0" w:line="276" w:lineRule="exact"/>
+        <w:ind w:left="3744" w:firstLine="0"/>
+        <w:jc w:val="left"/>
+      </w:pPr>
+      <w:r>
+        <w:t xml:space="preserve">Fax: </w:t>
+      </w:r>
+      <w:r>
+        <w:t xml:space="preserve">[not</w:t>
+      </w:r>
+      <w:r>
+        <w:t xml:space="preserve"> </w:t>
+      </w:r>
+      <w:r>
+        <w:t xml:space="preserve">on</w:t>
+      </w:r>
+      <w:r>
+        <w:t xml:space="preserve"> </w:t>
+      </w:r>
+      <w:r>
+        <w:t xml:space="preserve">the</w:t>
+      </w:r>
+      <w:r>
+        <w:t xml:space="preserve"> </w:t>
+      </w:r>
+      <w:r>
+        <w:t xml:space="preserve">filed</w:t>
+      </w:r>
+      <w:r>
+        <w:t xml:space="preserve"> </w:t>
+      </w:r>
+      <w:r>
+        <w:t xml:space="preserve">copy]</w:t>
+      </w:r>
+    </w:p>
+    <w:p>
+      <w:pPr>
+        <w:keepNext/>
+        <w:keepLines/>
+        <w:spacing w:before="0" w:after="0" w:line="276" w:lineRule="exact"/>
+        <w:ind w:left="3744" w:firstLine="0"/>
+        <w:jc w:val="left"/>
+      </w:pPr>
+      <w:r>
+        <w:t xml:space="preserve">E-mail: </w:t>
+      </w:r>
+      <w:r>
+        <w:t xml:space="preserve">elally@lally-legal.com</w:t>
+      </w:r>
+    </w:p>
+    <w:p>
+      <w:pPr>
+        <w:spacing w:before="240" w:after="0" w:line="276" w:lineRule="exact"/>
+        <w:ind w:left="3744" w:firstLine="0"/>
+        <w:jc w:val="left"/>
+      </w:pPr>
+      <w:r>
+        <w:t xml:space="preserve">Attorney</w:t>
+      </w:r>
+      <w:r>
+        <w:t xml:space="preserve"> </w:t>
+      </w:r>
+      <w:r>
+        <w:t xml:space="preserve">for</w:t>
+      </w:r>
+      <w:r>
+        <w:t xml:space="preserve"> </w:t>
+      </w:r>
+      <w:r>
+        <w:t xml:space="preserve">Plaintiff</w:t>
+      </w:r>
+      <w:r>
+        <w:t xml:space="preserve"> </w:t>
+      </w:r>
+      <w:r>
+        <w:t xml:space="preserve">Trustee</w:t>
+      </w:r>
     </w:p>
     <w:sectPr>
-      <w:footerReference w:type="default" r:id="rIdFooter1"/>
-      <w:footnotePr>
-        <w:numRestart w:val="eachSect"/>
-      </w:footnotePr>
+      <w:footerReference w:type="default" r:id="rIdFooter2"/>
       <w:pgSz w:w="12240" w:h="15840"/>
-      <w:pgMar w:top="1440" w:right="1440" w:bottom="1440" w:left="1440" w:header="720" w:footer="720" w:gutter="0"/>
+      <w:pgMar w:top="1520" w:right="1440" w:bottom="1440" w:left="1440" w:header="720" w:footer="768" w:gutter="0"/>
       <w:cols w:space="720"/>
     </w:sectPr>
   </w:body>
@@ -991,7 +1313,32 @@
 <w:ftr xmlns:w="http://schemas.openxmlformats.org/wordprocessingml/2006/main" xmlns:r="http://schemas.openxmlformats.org/officeDocument/2006/relationships">
   <w:p>
     <w:pPr>
-      <w:spacing w:before="0" w:after="0" w:line="240" w:lineRule="auto"/>
+      <w:jc w:val="center"/>
+    </w:pPr>
+    <w:r>
+      <w:fldChar w:fldCharType="begin"/>
+    </w:r>
+    <w:r>
+      <w:instrText xml:space="preserve"> PAGE </w:instrText>
+    </w:r>
+    <w:r>
+      <w:fldChar w:fldCharType="separate"/>
+    </w:r>
+    <w:r>
+      <w:t>1</w:t>
+    </w:r>
+    <w:r>
+      <w:fldChar w:fldCharType="end"/>
+    </w:r>
+  </w:p>
+</w:ftr>
+</file>
+
+<file path=word/footer2.xml><?xml version="1.0" encoding="utf-8"?>
+<w:ftr xmlns:w="http://schemas.openxmlformats.org/wordprocessingml/2006/main" xmlns:r="http://schemas.openxmlformats.org/officeDocument/2006/relationships">
+  <w:p>
+    <w:pPr>
+      <w:spacing w:before="0" w:after="0" w:line="240" w:lineRule="exact"/>
       <w:jc w:val="center"/>
     </w:pPr>
     <w:r>
@@ -1190,15 +1537,16 @@
   <w:docDefaults>
     <w:rPrDefault>
       <w:rPr>
-        <w:rFonts w:ascii="EB Garamond" w:eastAsia="EB Garamond" w:hAnsi="EB Garamond" w:cs="EB Garamond"/>
-        <w:sz w:val="26"/>
-        <w:szCs w:val="26"/>
-        <w:lang w:val="en-US" w:eastAsia="en-US" w:bidi="ar-SA"/>
+        <w:rFonts w:ascii="Times New Roman" w:hAnsi="Times New Roman" w:eastAsia="Times New Roman" w:cs="Times New Roman"/>
+        <w:sz w:val="24"/>
+        <w:szCs w:val="24"/>
+        <w:lang w:val="en-US" w:eastAsia="zh-CN" w:bidi="ar-SA"/>
       </w:rPr>
     </w:rPrDefault>
     <w:pPrDefault>
       <w:pPr>
-        <w:spacing w:before="0" w:after="0" w:line="240" w:lineRule="auto"/>
+        <w:widowControl/>
+        <w:spacing w:after="0"/>
       </w:pPr>
     </w:pPrDefault>
   </w:docDefaults>
@@ -1206,12 +1554,6 @@
   <w:style w:type="paragraph" w:default="1" w:styleId="Normal">
     <w:name w:val="Normal"/>
     <w:qFormat/>
-    <w:pPr>
-      <w:widowControl/>
-    </w:pPr>
-    <w:rPr>
-      <w:color w:val="000000"/>
-    </w:rPr>
   </w:style>
   <w:style w:type="paragraph" w:styleId="BodyText">
     <w:name w:val="Body Text"/>
@@ -1219,7 +1561,7 @@
     <w:link w:val="BodyTextChar"/>
     <w:qFormat/>
     <w:pPr>
-      <w:spacing w:before="0" w:after="156" w:line="481" w:lineRule="exact"/>
+      <w:spacing w:before="0" w:after="0" w:line="480" w:lineRule="exact"/>
       <w:ind w:firstLine="720"/>
     </w:pPr>
   </w:style>
@@ -1234,7 +1576,7 @@
     <w:basedOn w:val="BodyText"/>
     <w:qFormat/>
     <w:pPr>
-      <w:spacing w:before="0" w:after="0" w:line="481" w:lineRule="exact"/>
+      <w:spacing w:before="36" w:after="36"/>
     </w:pPr>
   </w:style>
   <w:style w:type="paragraph" w:styleId="Title">
@@ -1374,12 +1716,11 @@
     <w:name w:val="heading 1"/>
     <w:basedOn w:val="Normal"/>
     <w:next w:val="BodyText"/>
-    <w:uiPriority w:val="9"/>
     <w:qFormat/>
     <w:pPr>
       <w:keepNext/>
       <w:keepLines/>
-      <w:spacing w:before="240" w:after="182" w:line="481" w:lineRule="exact"/>
+      <w:spacing w:before="240" w:after="168" w:line="480" w:lineRule="exact"/>
       <w:ind w:firstLine="0"/>
       <w:jc w:val="center"/>
       <w:outlineLvl w:val="0"/>
@@ -1388,21 +1729,19 @@
       <w:b/>
       <w:bCs/>
       <w:color w:val="000000"/>
-      <w:sz w:val="26"/>
-      <w:szCs w:val="26"/>
+      <w:sz w:val="24"/>
+      <w:szCs w:val="24"/>
     </w:rPr>
   </w:style>
   <w:style w:type="paragraph" w:styleId="Heading2">
     <w:name w:val="heading 2"/>
     <w:basedOn w:val="Normal"/>
     <w:next w:val="BodyText"/>
-    <w:uiPriority w:val="9"/>
-    <w:unhideWhenUsed/>
     <w:qFormat/>
     <w:pPr>
       <w:keepNext/>
       <w:keepLines/>
-      <w:spacing w:before="240" w:after="182" w:line="481" w:lineRule="exact"/>
+      <w:spacing w:before="240" w:after="168" w:line="480" w:lineRule="exact"/>
       <w:ind w:firstLine="0"/>
       <w:jc w:val="center"/>
       <w:outlineLvl w:val="1"/>
@@ -1411,8 +1750,8 @@
       <w:b/>
       <w:bCs/>
       <w:color w:val="000000"/>
-      <w:sz w:val="26"/>
-      <w:szCs w:val="26"/>
+      <w:sz w:val="24"/>
+      <w:szCs w:val="24"/>
     </w:rPr>
   </w:style>
   <w:style w:type="paragraph" w:styleId="Heading3">
@@ -1428,14 +1767,17 @@
     <w:pPr>
       <w:keepNext/>
       <w:keepLines/>
-      <w:spacing w:before="160" w:after="80"/>
+      <w:spacing w:before="240" w:after="168" w:line="480" w:lineRule="exact"/>
+      <w:ind w:firstLine="0"/>
       <w:outlineLvl w:val="2"/>
     </w:pPr>
     <w:rPr>
-      <w:rFonts w:eastAsiaTheme="majorEastAsia" w:cstheme="majorBidi"/>
-      <w:color w:val="0F4761" w:themeColor="accent1" w:themeShade="BF"/>
-      <w:sz w:val="28"/>
-      <w:szCs w:val="28"/>
+      <w:rFonts w:ascii="Times New Roman" w:hAnsi="Times New Roman" w:eastAsia="Times New Roman" w:cs="Times New Roman"/>
+      <w:b/>
+      <w:bCs/>
+      <w:color w:val="000000"/>
+      <w:sz w:val="24"/>
+      <w:szCs w:val="24"/>
     </w:rPr>
   </w:style>
   <w:style w:type="paragraph" w:styleId="Heading4">
@@ -1451,14 +1793,18 @@
     <w:pPr>
       <w:keepNext/>
       <w:keepLines/>
-      <w:spacing w:before="80" w:after="40"/>
+      <w:spacing w:before="240" w:after="168" w:line="480" w:lineRule="exact"/>
+      <w:ind w:firstLine="0"/>
       <w:outlineLvl w:val="3"/>
     </w:pPr>
     <w:rPr>
-      <w:rFonts w:eastAsiaTheme="majorEastAsia" w:cstheme="majorBidi"/>
+      <w:rFonts w:ascii="Times New Roman" w:hAnsi="Times New Roman" w:eastAsia="Times New Roman" w:cs="Times New Roman"/>
+      <w:b/>
+      <w:bCs/>
       <w:i/>
-      <w:iCs/>
-      <w:color w:val="0F4761" w:themeColor="accent1" w:themeShade="BF"/>
+      <w:color w:val="000000"/>
+      <w:sz w:val="24"/>
+      <w:szCs w:val="24"/>
     </w:rPr>
   </w:style>
   <w:style w:type="paragraph" w:styleId="Heading5">
@@ -1474,12 +1820,18 @@
     <w:pPr>
       <w:keepNext/>
       <w:keepLines/>
-      <w:spacing w:before="80" w:after="40"/>
+      <w:spacing w:before="240" w:after="168" w:line="480" w:lineRule="exact"/>
+      <w:ind w:firstLine="0"/>
       <w:outlineLvl w:val="4"/>
     </w:pPr>
     <w:rPr>
-      <w:rFonts w:eastAsiaTheme="majorEastAsia" w:cstheme="majorBidi"/>
-      <w:color w:val="0F4761" w:themeColor="accent1" w:themeShade="BF"/>
+      <w:rFonts w:ascii="Times New Roman" w:hAnsi="Times New Roman" w:eastAsia="Times New Roman" w:cs="Times New Roman"/>
+      <w:b/>
+      <w:bCs/>
+      <w:i/>
+      <w:color w:val="000000"/>
+      <w:sz w:val="24"/>
+      <w:szCs w:val="24"/>
     </w:rPr>
   </w:style>
   <w:style w:type="paragraph" w:styleId="Heading6">
@@ -1689,6 +2041,15 @@
       <w:color w:val="272727" w:themeColor="text1" w:themeTint="D8"/>
     </w:rPr>
   </w:style>
+  <w:style w:type="paragraph" w:customStyle="1" w:styleId="ListItem">
+    <w:name w:val="List Item"/>
+    <w:basedOn w:val="BodyText"/>
+    <w:qFormat/>
+    <w:pPr>
+      <w:spacing w:before="0" w:after="0" w:line="480" w:lineRule="exact"/>
+      <w:ind w:left="720" w:hanging="720"/>
+    </w:pPr>
+  </w:style>
   <w:style w:type="paragraph" w:styleId="BlockText">
     <w:name w:val="Block Text"/>
     <w:basedOn w:val="BodyText"/>
@@ -1697,22 +2058,24 @@
     <w:unhideWhenUsed/>
     <w:qFormat/>
     <w:pPr>
-      <w:spacing w:before="100" w:after="100"/>
-      <w:ind w:firstLine="0" w:left="480" w:right="480"/>
+      <w:spacing w:before="280" w:after="280" w:line="276" w:lineRule="exact"/>
+      <w:ind w:firstLine="0" w:left="720" w:right="720"/>
     </w:pPr>
   </w:style>
   <w:style w:type="paragraph" w:styleId="FootnoteText">
     <w:name w:val="Footnote Text"/>
     <w:basedOn w:val="Normal"/>
+    <w:next w:val="FootnoteText"/>
     <w:uiPriority w:val="9"/>
     <w:unhideWhenUsed/>
     <w:qFormat/>
     <w:pPr>
-      <w:spacing w:before="0" w:after="0" w:line="254" w:lineRule="exact"/>
-    </w:pPr>
-    <w:rPr>
-      <w:sz w:val="22"/>
-      <w:szCs w:val="22"/>
+      <w:keepLines/>
+      <w:spacing w:before="0" w:after="140" w:line="276" w:lineRule="exact"/>
+    </w:pPr>
+    <w:rPr>
+      <w:sz w:val="24"/>
+      <w:szCs w:val="24"/>
     </w:rPr>
   </w:style>
   <w:style w:type="paragraph" w:styleId="FootnoteBlockText">
@@ -1723,8 +2086,8 @@
     <w:unhideWhenUsed/>
     <w:qFormat/>
     <w:pPr>
-      <w:spacing w:before="100" w:after="100"/>
-      <w:ind w:firstLine="0" w:left="480" w:right="480"/>
+      <w:spacing w:before="280" w:after="280"/>
+      <w:ind w:firstLine="0" w:left="720" w:right="720"/>
     </w:pPr>
   </w:style>
   <w:style w:type="character" w:default="1" w:styleId="DefaultParagraphFont">
@@ -1832,7 +2195,7 @@
     <w:name w:val="Hyperlink"/>
     <w:basedOn w:val="BodyTextChar"/>
     <w:rPr>
-      <w:color w:val="4F81BD" w:themeColor="accent1"/>
+      <w:color w:val="000000"/>
     </w:rPr>
   </w:style>
   <w:style w:type="paragraph" w:styleId="TOCHeading">
@@ -1853,6 +2216,15 @@
       <w:color w:val="365F91" w:themeColor="accent1" w:themeShade="BF"/>
     </w:rPr>
   </w:style>
+  <w:style w:type="paragraph" w:customStyle="1" w:styleId="PlainParagraph">
+    <w:name w:val="Plain Paragraph"/>
+    <w:basedOn w:val="BodyText"/>
+    <w:qFormat/>
+    <w:pPr>
+      <w:spacing w:before="0" w:after="144" w:line="480" w:lineRule="exact"/>
+      <w:ind w:firstLine="720"/>
+    </w:pPr>
+  </w:style>
   <w:style w:type="paragraph" w:customStyle="1" w:styleId="NumberedParagraph">
     <w:name w:val="Numbered Paragraph"/>
     <w:basedOn w:val="BodyText"/>
@@ -1861,7 +2233,7 @@
       <w:tabs>
         <w:tab w:val="left" w:pos="1200"/>
       </w:tabs>
-      <w:spacing w:before="0" w:after="0" w:line="481" w:lineRule="exact"/>
+      <w:spacing w:before="0" w:after="0" w:line="480" w:lineRule="exact"/>
       <w:ind w:firstLine="720"/>
     </w:pPr>
   </w:style>
@@ -1873,7 +2245,7 @@
       <w:tabs>
         <w:tab w:val="left" w:pos="1440"/>
       </w:tabs>
-      <w:spacing w:before="0" w:after="156" w:line="481" w:lineRule="exact"/>
+      <w:spacing w:before="0" w:after="144" w:line="480" w:lineRule="exact"/>
       <w:ind w:left="1440" w:hanging="720"/>
     </w:pPr>
   </w:style>

</xml_diff>